<commit_message>
v3.4: fix dynamic relabel whitelist & mixed-pool evaluation, add fitz PDF bbox anchors, InsQABench 1k retrieval & 50-item eval, 10-insurer 36-PDF expansion, and WUT 6-chapter master's thesis
</commit_message>
<xml_diff>
--- a/paper/Cover_Letter.docx
+++ b/paper/Cover_Letter.docx
@@ -3,75 +3,83 @@
 <w:document xmlns:wpc="http://schemas.microsoft.com/office/word/2010/wordprocessingCanvas" xmlns:mo="http://schemas.microsoft.com/office/mac/office/2008/main" xmlns:mc="http://schemas.openxmlformats.org/markup-compatibility/2006" xmlns:mv="urn:schemas-microsoft-com:mac:vml" xmlns:o="urn:schemas-microsoft-com:office:office" xmlns:r="http://schemas.openxmlformats.org/officeDocument/2006/relationships" xmlns:m="http://schemas.openxmlformats.org/officeDocument/2006/math" xmlns:v="urn:schemas-microsoft-com:vml" xmlns:wp14="http://schemas.microsoft.com/office/word/2010/wordprocessingDrawing" xmlns:wp="http://schemas.openxmlformats.org/drawingml/2006/wordprocessingDrawing" xmlns:w10="urn:schemas-microsoft-com:office:word" xmlns:w="http://schemas.openxmlformats.org/wordprocessingml/2006/main" xmlns:w14="http://schemas.microsoft.com/office/word/2010/wordml" xmlns:wpg="http://schemas.microsoft.com/office/word/2010/wordprocessingGroup" xmlns:wpi="http://schemas.microsoft.com/office/word/2010/wordprocessingInk" xmlns:wne="http://schemas.microsoft.com/office/word/2006/wordml" xmlns:wps="http://schemas.microsoft.com/office/word/2010/wordprocessingShape" mc:Ignorable="w14 wp14">
   <w:body>
     <w:p>
-      <w:pPr>
-        <w:pStyle w:val="Heading1"/>
-      </w:pPr>
       <w:r>
-        <w:t>Submission Cover Letter</w:t>
+        <w:t>October 28, 2026</w:t>
       </w:r>
     </w:p>
     <w:p>
       <w:r>
-        <w:t>Dear Editor-in-Chief and Editorial Board,</w:t>
+        <w:t>Editorial Board</w:t>
+        <w:br/>
+        <w:t>Expert Systems with Applications / Information Processing &amp; Management</w:t>
+        <w:br/>
+        <w:t>Elsevier</w:t>
       </w:r>
     </w:p>
     <w:p>
       <w:r>
-        <w:t>We are pleased to submit our original research manuscript entitled "Do Synthetic Queries Preserve Insurance Eligibility Decisions? Decision-Preserving Verification and Repair for Vertical RAG" for consideration for publication as a Full Length Article in Expert Systems with Applications.</w:t>
+        <w:t>Subject: Submission of Original Research Article: "Do Synthetic Queries Preserve Insurance Eligibility Decisions? Clause-Grounded Verification, Repair, and RAG Evaluation Integrity"</w:t>
       </w:r>
     </w:p>
     <w:p>
       <w:r>
-        <w:t>In rule-governed vertical domains such as insurance underwriting, healthcare eligibility, and regulatory compliance, industrial engineering teams routinely rely on instruction-tuned Large Language Models (LLMs) to synthesize evaluation queries from contract clauses due to a lack of anonymized real user logs. However, existing benchmark construction pipelines prioritize retrieval hit rate and conversational fluency, overlooking whether critical legal qualification conditions are preserved.</w:t>
+        <w:t>Dear Editors,</w:t>
       </w:r>
     </w:p>
     <w:p>
       <w:r>
-        <w:t>In this work, we demonstrate that unconstrained conversational query synthesis achieves high Top-1 retrieval while suffering 77.5%–85.0% decision degradation. When deployed to evaluate nine real end-to-end cloud LLM RAG pipelines, this synthetic label corruption systematically penalizes prudent abstention-capable systems and reverses downstream system rankings (Kendall's tau = -0.8792 on Qwen-Plus and -0.6973 on DeepSeek).</w:t>
+        <w:t>Please find enclosed our original research manuscript, "Do Synthetic Queries Preserve Insurance Eligibility Decisions? Clause-Grounded Verification, Repair, and RAG Evaluation Integrity," by Shunchi Wang, for consideration for publication as a Regular Research Paper.</w:t>
       </w:r>
     </w:p>
     <w:p>
       <w:r>
-        <w:t>To address this challenge, we introduce a neuro-symbolic reachability verification and slot-guard repair framework grounded in 26 official Chinese commercial insurance policy PDFs and 8 multi-threshold rule families:</w:t>
-        <w:br/>
-        <w:t>1. We formalize eligibility clauses into threshold-partitioned reachability equivalence regions, separating surface slot completeness from reference-independent decision determinacy.</w:t>
-        <w:br/>
-        <w:t>2. We demonstrate that zero-call symbolic reachability detection and dynamic label re-certification (with zero additional LLM calls and no query editing) slashes single-arm RAG evaluation MAE from 0.6556 down to 0.0936 (an 85.7% error reduction, flipping rank correlation tau from -0.8792 to +0.9062), and on an 80-query mixed uncurated pool from 0.3292 down to 0.0504 (outperforming a constant-CLARIFY counter-baseline at MAE 0.4222 by 88.1%).</w:t>
-        <w:br/>
-        <w:t>3. We provide a 4-stage marginal gain decomposition across all 176 pooled pairs (88 seeds across 25 clause clusters and 21 independent source documents), demonstrating that targeted second-pass repair reaches 98.86% deterministic symbolic validity (p_Holm_doc &lt;= 0.015625 against all six baselines).</w:t>
-        <w:br/>
-        <w:t>4. All experiments are verified with a dual-mode 3-flagship adjudication panel (Kimi-K3, DeepSeek-V4-Pro, Qwen3.8-Max), 9 end-to-end cloud LLM RAG pipelines, an independent 48-query External Holdout Benchmark, and an uncontaminated 17-PDF zero-shot schema extraction audit.</w:t>
+        <w:t>Retrieval-augmented generation (RAG) benchmarks in regulated domains such as insurance, healthcare, and law increasingly rely on instruction-tuned large language models (LLMs) to synthesize user test queries from source clauses. In this study, we identify and formalize a critical failure mode in synthetic RAG benchmarking: Retrieval-Preserving Decision Drift. Across 36 official Chinese insurance policy contracts spanning 10 insurers, a 1,000-clause external Chinese insurance pool and 50 real user queries from Fudan University's open-source InsQABench benchmark, and 9 end-to-end cloud LLM RAG pipelines (4,067 cached reader evaluations), we show that unconstrained conversational rewrites achieve high retrieval recall yet omit or alter threshold and exception conditions in 97.5%–100.0% of queries. Crucially, inheriting the source seed's binary eligibility label on such underspecified queries penalizes safety-aligned abstaining RAG readers and systematically inverts system rankings (Kendall's tau = -0.8792 on Qwen-Plus and -0.6973 on DeepSeek; MAE up to 0.6556).</w:t>
       </w:r>
     </w:p>
     <w:p>
       <w:r>
-        <w:t>The entire study is 100% reproducible with 36 deterministic unit tests and offline rescoring scripts publicly available at https://github.com/jakelihua/chinese-insurance-rag-benchmark.</w:t>
+        <w:t>To resolve this benchmark contamination, we develop a clause-grounded symbolic reachability verifier and a 4-stage verification-and-repair framework:</w:t>
       </w:r>
     </w:p>
     <w:p>
       <w:r>
-        <w:t>We confirm that this manuscript is original, has not been published previously, and is not under consideration for publication elsewhere. All authors have approved the submission.</w:t>
+        <w:t>1. Zero-Call Symbolic Reachability Re-Certification (zero_call_verifier_dynamic_relabel): Without making any additional LLM calls or editing query text, our forward reachability verifier dynamically re-certifies underspecified queries to CLARIFY and filters threshold-mutated or parse-uncertain queries, slashing single-arm RAG evaluation MAE from 0.6556 to 0.0936 (Qwen-Plus, 38/40 accepted, tau = +0.9062) and from 0.5250 to 0.1222 (DeepSeek, 40/40 accepted, tau = +0.7812), and reducing MAE on a realistic 80-query mixed uncurated pool from 0.3292 to 0.0504 (Qwen-Plus, 75/80 accepted) and from 0.2986 to 0.0816 (DeepSeek, 79/80 accepted), where a trivial constant-CLARIFY baseline fails (MAE 0.4222 / 0.4333).</w:t>
       </w:r>
     </w:p>
     <w:p>
       <w:r>
-        <w:t>Thank you very much for your time and consideration of our work.</w:t>
+        <w:t>2. Targeted Diagnostic Repair (slot_guard_repair): Across all 88 seeds and 2 model families (N=176 pairs across 25 clause clusters and 21 source documents), parser-guided second-pass repair achieves 98.86% (174/176) strict symbolic usability, outperforming all 6 LLM baselines with zero discordant losses (all 6 Holm-adjusted document-cluster p &lt;= 0.015625).</w:t>
+      </w:r>
+    </w:p>
+    <w:p>
+      <w:r>
+        <w:t>3. Large-Scale Retrieval &amp; Multi-Insurer Generalization: On a 1,000-clause pool combining our confirmation passages with 952 external clauses from Fudan University's InsQABench, LLM rewriting improves title-masked dense retrieval MRR by +92.5% over raw templates (0.4408 vs. 0.2290), achieves 94.00% (47/50, kappa = 0.9032) decision agreement on 50 real InsQABench user queries, and reaches 27/27 (100.0%) symbolic waiting-period schema extraction across 27 waiting-period contracts from 10 insurers.</w:t>
+      </w:r>
+    </w:p>
+    <w:p>
+      <w:r>
+        <w:t>All code, character-level PDF bounding-box anchors, cached model generations, and deterministic offline verification scripts are publicly available at https://github.com/wangshunchi/insurance-rag-decision-preservation and archived on Zenodo (https://doi.org/10.5281/zenodo.19655712). This manuscript is original, has not been published previously, and is not under consideration elsewhere. The author declares no competing financial or personal interests.</w:t>
+      </w:r>
+    </w:p>
+    <w:p>
+      <w:r>
+        <w:t>Thank you for your time and consideration.</w:t>
       </w:r>
     </w:p>
     <w:p>
       <w:r>
         <w:t>Sincerely,</w:t>
-      </w:r>
-    </w:p>
-    <w:p>
-      <w:r>
+        <w:br/>
+        <w:br/>
         <w:t>Shunchi Wang</w:t>
         <w:br/>
         <w:t>Independent Researcher</w:t>
         <w:br/>
         <w:t>Email: jakelihua@gmail.com</w:t>
         <w:br/>
-        <w:t>ORCID: https://orcid.org/0009-0009-8629-2078</w:t>
+        <w:t>GitHub: https://github.com/wangshunchi/insurance-rag-decision-preservation</w:t>
+        <w:br/>
+        <w:t>Zenodo DOI: https://doi.org/10.5281/zenodo.19655712</w:t>
       </w:r>
     </w:p>
     <w:sectPr>

</xml_diff>

<commit_message>
Fix v3.4 audit bugs: pure PDF spans, unit-safe superscript cleaning, InsQABench 9+41 stratification, and WUT thesis/manuscript sync
</commit_message>
<xml_diff>
--- a/paper/Cover_Letter.docx
+++ b/paper/Cover_Letter.docx
@@ -3,73 +3,76 @@
 <w:document xmlns:wpc="http://schemas.microsoft.com/office/word/2010/wordprocessingCanvas" xmlns:mo="http://schemas.microsoft.com/office/mac/office/2008/main" xmlns:mc="http://schemas.openxmlformats.org/markup-compatibility/2006" xmlns:mv="urn:schemas-microsoft-com:mac:vml" xmlns:o="urn:schemas-microsoft-com:office:office" xmlns:r="http://schemas.openxmlformats.org/officeDocument/2006/relationships" xmlns:m="http://schemas.openxmlformats.org/officeDocument/2006/math" xmlns:v="urn:schemas-microsoft-com:vml" xmlns:wp14="http://schemas.microsoft.com/office/word/2010/wordprocessingDrawing" xmlns:wp="http://schemas.openxmlformats.org/drawingml/2006/wordprocessingDrawing" xmlns:w10="urn:schemas-microsoft-com:office:word" xmlns:w="http://schemas.openxmlformats.org/wordprocessingml/2006/main" xmlns:w14="http://schemas.microsoft.com/office/word/2010/wordml" xmlns:wpg="http://schemas.microsoft.com/office/word/2010/wordprocessingGroup" xmlns:wpi="http://schemas.microsoft.com/office/word/2010/wordprocessingInk" xmlns:wne="http://schemas.microsoft.com/office/word/2006/wordml" xmlns:wps="http://schemas.microsoft.com/office/word/2010/wordprocessingShape" mc:Ignorable="w14 wp14">
   <w:body>
     <w:p>
+      <w:pPr>
+        <w:pStyle w:val="Heading1"/>
+      </w:pPr>
       <w:r>
-        <w:t>October 28, 2026</w:t>
+        <w:t>Cover Letter</w:t>
       </w:r>
     </w:p>
     <w:p>
       <w:r>
-        <w:t>Editorial Board</w:t>
-        <w:br/>
-        <w:t>Expert Systems with Applications / Information Processing &amp; Management</w:t>
-        <w:br/>
-        <w:t>Elsevier</w:t>
+        <w:t>Dear Editor-in-Chief and Editorial Board,</w:t>
       </w:r>
     </w:p>
     <w:p>
       <w:r>
-        <w:t>Subject: Submission of Original Research Article: "Do Synthetic Queries Preserve Insurance Eligibility Decisions? Clause-Grounded Verification, Repair, and RAG Evaluation Integrity"</w:t>
+        <w:t>We are pleased to submit our original research manuscript entitled "Do Synthetic Queries Preserve Insurance Eligibility Decisions? Decision-Preserving Verification and Repair for Vertical RAG" for consideration for publication as a Full Length Article in Expert Systems with Applications.</w:t>
       </w:r>
     </w:p>
     <w:p>
       <w:r>
-        <w:t>Dear Editors,</w:t>
+        <w:t>In rule-governed vertical domains such as insurance underwriting, healthcare eligibility, and regulatory compliance, industrial engineering teams routinely rely on instruction-tuned Large Language Models (LLMs) to synthesize evaluation queries from contract clauses due to a lack of anonymized real user logs. However, existing benchmark construction pipelines prioritize retrieval hit rate and conversational fluency, overlooking whether critical legal qualification conditions are preserved.</w:t>
       </w:r>
     </w:p>
     <w:p>
       <w:r>
-        <w:t>Please find enclosed our original research manuscript, "Do Synthetic Queries Preserve Insurance Eligibility Decisions? Clause-Grounded Verification, Repair, and RAG Evaluation Integrity," by Shunchi Wang, for consideration for publication as a Regular Research Paper.</w:t>
+        <w:t>In this work, we demonstrate that unconstrained conversational query synthesis achieves high Top-1 retrieval while suffering 77.5%–85.0% decision degradation. When deployed to evaluate nine real end-to-end cloud LLM RAG pipelines, this synthetic label corruption systematically penalizes prudent abstention-capable systems and reverses downstream system rankings (Kendall's tau = -0.8792 on Qwen-Plus and -0.6973 on DeepSeek).</w:t>
       </w:r>
     </w:p>
     <w:p>
       <w:r>
-        <w:t>Retrieval-augmented generation (RAG) benchmarks in regulated domains such as insurance, healthcare, and law increasingly rely on instruction-tuned large language models (LLMs) to synthesize user test queries from source clauses. In this study, we identify and formalize a critical failure mode in synthetic RAG benchmarking: Retrieval-Preserving Decision Drift. Across 36 official Chinese insurance policy contracts spanning 10 insurers, a 1,000-clause external Chinese insurance pool and 50 real user queries from Fudan University's open-source InsQABench benchmark, and 9 end-to-end cloud LLM RAG pipelines (4,067 cached reader evaluations), we show that unconstrained conversational rewrites achieve high retrieval recall yet omit or alter threshold and exception conditions in 97.5%–100.0% of queries. Crucially, inheriting the source seed's binary eligibility label on such underspecified queries penalizes safety-aligned abstaining RAG readers and systematically inverts system rankings (Kendall's tau = -0.8792 on Qwen-Plus and -0.6973 on DeepSeek; MAE up to 0.6556).</w:t>
+        <w:t>To address this challenge, we introduce a neuro-symbolic reachability verification and slot-guard repair framework grounded in 36 official Chinese commercial insurance policy PDFs across 10 insurer groups (plus a 1,000-clause real insurance distractor pool and 50 external items from Fudan University's InsQABench) and 8 multi-threshold rule families:</w:t>
       </w:r>
     </w:p>
     <w:p>
       <w:r>
-        <w:t>To resolve this benchmark contamination, we develop a clause-grounded symbolic reachability verifier and a 4-stage verification-and-repair framework:</w:t>
+        <w:t>1. We formalize eligibility clauses into threshold-partitioned reachability equivalence regions, separating surface slot completeness from reference-independent decision determinacy.</w:t>
       </w:r>
     </w:p>
     <w:p>
       <w:r>
-        <w:t>1. Zero-Call Symbolic Reachability Re-Certification (zero_call_verifier_dynamic_relabel): Without making any additional LLM calls or editing query text, our forward reachability verifier dynamically re-certifies underspecified queries to CLARIFY and filters threshold-mutated or parse-uncertain queries, slashing single-arm RAG evaluation MAE from 0.6556 to 0.0936 (Qwen-Plus, 38/40 accepted, tau = +0.9062) and from 0.5250 to 0.1222 (DeepSeek, 40/40 accepted, tau = +0.7812), and reducing MAE on a realistic 80-query mixed uncurated pool from 0.3292 to 0.0504 (Qwen-Plus, 75/80 accepted) and from 0.2986 to 0.0816 (DeepSeek, 79/80 accepted), where a trivial constant-CLARIFY baseline fails (MAE 0.4222 / 0.4333).</w:t>
+        <w:t>2. We demonstrate that zero-call symbolic reachability detection and dynamic label re-certification (with zero additional LLM calls and no query editing) slashes single-arm RAG evaluation MAE on unverified conversational queries from 0.6556 down to 0.0936 (an 85.7% error reduction, flipping rank correlation tau from -0.8792 to +0.9062), and on an 80-query mixed uncurated pool from 0.3292 down to 0.0504 (outperforming a constant-CLARIFY counter-baseline at MAE 0.4222 by 88.1%).</w:t>
       </w:r>
     </w:p>
     <w:p>
       <w:r>
-        <w:t>2. Targeted Diagnostic Repair (slot_guard_repair): Across all 88 seeds and 2 model families (N=176 pairs across 25 clause clusters and 21 source documents), parser-guided second-pass repair achieves 98.86% (174/176) strict symbolic usability, outperforming all 6 LLM baselines with zero discordant losses (all 6 Holm-adjusted document-cluster p &lt;= 0.015625).</w:t>
+        <w:t>3. We provide a 4-stage marginal gain decomposition across all 176 pooled pairs (88 seeds across 25 clause clusters and 21 independent source documents), demonstrating that targeted second-pass repair reaches 98.86% deterministic symbolic validity (p_Holm_doc &lt;= 0.015625 against all six baselines) and 98.75% dense/hybrid Top-1 (100.0% Hit@5) in the 1,000-clause InsQABench retrieval pool.</w:t>
       </w:r>
     </w:p>
     <w:p>
       <w:r>
-        <w:t>3. Large-Scale Retrieval &amp; Multi-Insurer Generalization: On a 1,000-clause pool combining our confirmation passages with 952 external clauses from Fudan University's InsQABench, LLM rewriting improves title-masked dense retrieval MRR by +92.5% over raw templates (0.4408 vs. 0.2290), achieves 94.00% (47/50, kappa = 0.9032) decision agreement on 50 real InsQABench user queries, and reaches 27/27 (100.0%) symbolic waiting-period schema extraction across 27 waiting-period contracts from 10 insurers.</w:t>
+        <w:t>4. All experiments are verified with a dual-mode 3-flagship adjudication panel (Kimi-K3, DeepSeek-V4-Pro, Qwen3.8-Max), 9 end-to-end cloud LLM RAG pipelines, an independent 48-query External Holdout Benchmark, an uncontaminated 17-PDF three-flagship schema extraction audit (94.1%–100.0%), 27/27 (100.0%) font-size-cleaned symbolic extraction across 27 waiting-period PDFs from 10 insurers, and 92.0% quantitative threshold coverage on 50 external InsQABench items.</w:t>
       </w:r>
     </w:p>
     <w:p>
       <w:r>
-        <w:t>All code, character-level PDF bounding-box anchors, cached model generations, and deterministic offline verification scripts are publicly available at https://github.com/wangshunchi/insurance-rag-decision-preservation and archived on Zenodo (https://doi.org/10.5281/zenodo.19655712). This manuscript is original, has not been published previously, and is not under consideration elsewhere. The author declares no competing financial or personal interests.</w:t>
+        <w:t>The entire study is 100% reproducible with 36 deterministic unit tests and offline rescoring scripts publicly available at https://github.com/jakelihua/chinese-insurance-rag-benchmark.</w:t>
       </w:r>
     </w:p>
     <w:p>
       <w:r>
-        <w:t>Thank you for your time and consideration.</w:t>
+        <w:t>We confirm that this manuscript is original, has not been published previously, and is not under consideration for publication elsewhere. All authors have approved the submission.</w:t>
+      </w:r>
+    </w:p>
+    <w:p>
+      <w:r>
+        <w:t>Thank you very much for your time and consideration of our work.</w:t>
       </w:r>
     </w:p>
     <w:p>
       <w:r>
         <w:t>Sincerely,</w:t>
-        <w:br/>
         <w:br/>
         <w:t>Shunchi Wang</w:t>
         <w:br/>
@@ -77,9 +80,7 @@
         <w:br/>
         <w:t>Email: jakelihua@gmail.com</w:t>
         <w:br/>
-        <w:t>GitHub: https://github.com/wangshunchi/insurance-rag-decision-preservation</w:t>
-        <w:br/>
-        <w:t>Zenodo DOI: https://doi.org/10.5281/zenodo.19655712</w:t>
+        <w:t>ORCID: https://orcid.org/0009-0009-8629-2078</w:t>
       </w:r>
     </w:p>
     <w:sectPr>

</xml_diff>